<commit_message>
polish(self-review C2,C4): trim P9 keywords 10->8; rename P7 jibs _source files to standard names; update upload index
</commit_message>
<xml_diff>
--- a/p7/submission/jibs_package/02_title_page.docx
+++ b/p7/submission/jibs_package/02_title_page.docx
@@ -1513,10 +1513,7 @@
     </w:tbl>
     <w:bookmarkEnd w:id="36"/>
     <w:bookmarkEnd w:id="37"/>
-    <w:sectPr>
-      <w:pgSz w:h="16838" w:w="11906"/>
-      <w:pgMar w:bottom="1417" w:left="1417" w:right="1417" w:top="1417"/>
-    </w:sectPr>
+    <w:sectPr/>
   </w:body>
 </w:document>
 </file>
@@ -1731,59 +1728,29 @@
   <w:style w:default="1" w:styleId="Normal" w:type="paragraph">
     <w:name w:val="Normal"/>
     <w:qFormat/>
-    <w:pPr>
-      <w:spacing w:line="276" w:lineRule="auto"/>
-      <w:jc w:val="both"/>
-    </w:pPr>
-    <w:rPr>
-      <w:rFonts w:ascii="Times New Roman" w:eastAsia="Times New Roman" w:hAnsi="Times New Roman"/>
-      <w:color w:val="000000"/>
-      <w:sz w:val="24"/>
-    </w:rPr>
   </w:style>
   <w:style w:styleId="BodyText" w:type="paragraph">
     <w:name w:val="Body Text"/>
     <w:basedOn w:val="Normal"/>
     <w:link w:val="BodyTextChar"/>
     <w:pPr>
-      <w:spacing w:after="180" w:before="180" w:line="276" w:lineRule="auto"/>
-      <w:jc w:val="both"/>
+      <w:spacing w:after="180" w:before="180"/>
     </w:pPr>
     <w:qFormat/>
-    <w:rPr>
-      <w:rFonts w:ascii="Times New Roman" w:eastAsia="Times New Roman" w:hAnsi="Times New Roman"/>
-      <w:color w:val="000000"/>
-      <w:sz w:val="24"/>
-    </w:rPr>
   </w:style>
   <w:style w:customStyle="1" w:styleId="FirstParagraph" w:type="paragraph">
     <w:name w:val="First Paragraph"/>
     <w:basedOn w:val="BodyText"/>
     <w:next w:val="BodyText"/>
     <w:qFormat/>
-    <w:pPr>
-      <w:spacing w:line="276" w:lineRule="auto"/>
-      <w:jc w:val="both"/>
-    </w:pPr>
-    <w:rPr>
-      <w:rFonts w:ascii="Times New Roman" w:eastAsia="Times New Roman" w:hAnsi="Times New Roman"/>
-      <w:color w:val="000000"/>
-      <w:sz w:val="24"/>
-    </w:rPr>
   </w:style>
   <w:style w:customStyle="1" w:styleId="Compact" w:type="paragraph">
     <w:name w:val="Compact"/>
     <w:basedOn w:val="BodyText"/>
     <w:qFormat/>
     <w:pPr>
-      <w:spacing w:after="36" w:before="36" w:line="276" w:lineRule="auto"/>
-      <w:jc w:val="both"/>
+      <w:spacing w:after="36" w:before="36"/>
     </w:pPr>
-    <w:rPr>
-      <w:rFonts w:ascii="Times New Roman" w:eastAsia="Times New Roman" w:hAnsi="Times New Roman"/>
-      <w:color w:val="000000"/>
-      <w:sz w:val="24"/>
-    </w:rPr>
   </w:style>
   <w:style w:styleId="Title" w:type="paragraph">
     <w:name w:val="Title"/>
@@ -1793,15 +1760,15 @@
     <w:pPr>
       <w:keepNext/>
       <w:keepLines/>
-      <w:spacing w:after="240" w:before="480" w:line="276" w:lineRule="auto"/>
-      <w:jc w:val="both"/>
+      <w:spacing w:after="240" w:before="480"/>
+      <w:jc w:val="center"/>
     </w:pPr>
     <w:rPr>
-      <w:rFonts w:ascii="Times New Roman" w:asciiTheme="majorHAnsi" w:cstheme="majorBidi" w:eastAsia="Times New Roman" w:eastAsiaTheme="majorEastAsia" w:hAnsi="Times New Roman" w:hAnsiTheme="majorHAnsi"/>
+      <w:rFonts w:asciiTheme="majorHAnsi" w:cstheme="majorBidi" w:eastAsiaTheme="majorEastAsia" w:hAnsiTheme="majorHAnsi"/>
       <w:b/>
       <w:bCs/>
-      <w:color w:val="000000"/>
-      <w:sz w:val="24"/>
+      <w:color w:themeColor="accent1" w:themeShade="B5" w:val="345A8A"/>
+      <w:sz w:val="36"/>
       <w:szCs w:val="36"/>
     </w:rPr>
   </w:style>
@@ -1813,13 +1780,11 @@
     <w:pPr>
       <w:keepNext/>
       <w:keepLines/>
-      <w:spacing w:after="240" w:before="240" w:line="276" w:lineRule="auto"/>
-      <w:jc w:val="both"/>
+      <w:spacing w:after="240" w:before="240"/>
+      <w:jc w:val="center"/>
     </w:pPr>
     <w:rPr>
-      <w:rFonts w:ascii="Times New Roman" w:eastAsia="Times New Roman" w:hAnsi="Times New Roman"/>
-      <w:color w:val="000000"/>
-      <w:sz w:val="24"/>
+      <w:sz w:val="30"/>
       <w:szCs w:val="30"/>
     </w:rPr>
   </w:style>
@@ -1830,14 +1795,8 @@
     <w:pPr>
       <w:keepNext/>
       <w:keepLines/>
-      <w:spacing w:line="276" w:lineRule="auto"/>
-      <w:jc w:val="both"/>
+      <w:jc w:val="center"/>
     </w:pPr>
-    <w:rPr>
-      <w:rFonts w:ascii="Times New Roman" w:eastAsia="Times New Roman" w:hAnsi="Times New Roman"/>
-      <w:color w:val="000000"/>
-      <w:sz w:val="24"/>
-    </w:rPr>
   </w:style>
   <w:style w:styleId="Date" w:type="paragraph">
     <w:name w:val="Date"/>
@@ -1846,14 +1805,8 @@
     <w:pPr>
       <w:keepNext/>
       <w:keepLines/>
-      <w:spacing w:line="276" w:lineRule="auto"/>
-      <w:jc w:val="both"/>
+      <w:jc w:val="center"/>
     </w:pPr>
-    <w:rPr>
-      <w:rFonts w:ascii="Times New Roman" w:eastAsia="Times New Roman" w:hAnsi="Times New Roman"/>
-      <w:color w:val="000000"/>
-      <w:sz w:val="24"/>
-    </w:rPr>
   </w:style>
   <w:style w:customStyle="1" w:styleId="AbstractTitle" w:type="paragraph">
     <w:name w:val="Abstract Title"/>
@@ -1863,15 +1816,15 @@
     <w:pPr>
       <w:keepNext/>
       <w:keepLines/>
-      <w:jc w:val="both"/>
-      <w:spacing w:after="0" w:before="300" w:line="276" w:lineRule="auto"/>
+      <w:jc w:val="center"/>
+      <w:spacing w:after="0" w:before="300"/>
     </w:pPr>
     <w:rPr>
-      <w:color w:val="000000"/>
-      <w:sz w:val="24"/>
+      <w:sz w:val="20"/>
       <w:szCs w:val="20"/>
-      <w:rFonts w:ascii="Times New Roman" w:eastAsia="Times New Roman" w:hAnsi="Times New Roman"/>
       <w:b/>
+      <w:color w:val="345A8A"/>
+      &gt;
     </w:rPr>
   </w:style>
   <w:style w:customStyle="1" w:styleId="Abstract" w:type="paragraph">
@@ -1882,13 +1835,10 @@
     <w:pPr>
       <w:keepNext/>
       <w:keepLines/>
-      <w:spacing w:after="300" w:before="100" w:line="276" w:lineRule="auto"/>
-      <w:jc w:val="both"/>
+      <w:spacing w:after="300" w:before="100"/>
     </w:pPr>
     <w:rPr>
-      <w:rFonts w:ascii="Times New Roman" w:eastAsia="Times New Roman" w:hAnsi="Times New Roman"/>
-      <w:color w:val="000000"/>
-      <w:sz w:val="24"/>
+      <w:sz w:val="20"/>
       <w:szCs w:val="20"/>
     </w:rPr>
   </w:style>
@@ -1897,15 +1847,8 @@
     <w:basedOn w:val="Normal"/>
     <w:next w:val="Bibliography"/>
     <w:qFormat/>
-    <w:pPr>
-      <w:spacing w:line="276" w:lineRule="auto"/>
-      <w:jc w:val="both"/>
-    </w:pPr>
-    <w:rPr>
-      <w:rFonts w:ascii="Times New Roman" w:eastAsia="Times New Roman" w:hAnsi="Times New Roman"/>
-      <w:color w:val="000000"/>
-      <w:sz w:val="24"/>
-    </w:rPr>
+    <w:pPr/>
+    <w:rPr/>
   </w:style>
   <w:style w:styleId="Heading1" w:type="paragraph">
     <w:name w:val="Heading 1"/>
@@ -1916,16 +1859,15 @@
     <w:pPr>
       <w:keepNext/>
       <w:keepLines/>
-      <w:spacing w:after="0" w:before="480" w:line="276" w:lineRule="auto"/>
-      <w:jc w:val="both"/>
+      <w:spacing w:after="0" w:before="480"/>
       <w:outlineLvl w:val="0"/>
     </w:pPr>
     <w:rPr>
-      <w:rFonts w:ascii="Times New Roman" w:asciiTheme="majorHAnsi" w:cstheme="majorBidi" w:eastAsia="Times New Roman" w:eastAsiaTheme="majorEastAsia" w:hAnsi="Times New Roman" w:hAnsiTheme="majorHAnsi"/>
+      <w:rFonts w:asciiTheme="majorHAnsi" w:cstheme="majorBidi" w:eastAsiaTheme="majorEastAsia" w:hAnsiTheme="majorHAnsi"/>
       <w:b/>
       <w:bCs/>
-      <w:color w:val="000000"/>
-      <w:sz w:val="24"/>
+      <w:color w:themeColor="accent1" w:val="4F81BD"/>
+      <w:sz w:val="32"/>
       <w:szCs w:val="32"/>
     </w:rPr>
   </w:style>
@@ -1939,16 +1881,15 @@
     <w:pPr>
       <w:keepNext/>
       <w:keepLines/>
-      <w:spacing w:after="0" w:before="200" w:line="276" w:lineRule="auto"/>
-      <w:jc w:val="both"/>
+      <w:spacing w:after="0" w:before="200"/>
       <w:outlineLvl w:val="1"/>
     </w:pPr>
     <w:rPr>
-      <w:rFonts w:ascii="Times New Roman" w:asciiTheme="majorHAnsi" w:cstheme="majorBidi" w:eastAsia="Times New Roman" w:eastAsiaTheme="majorEastAsia" w:hAnsi="Times New Roman" w:hAnsiTheme="majorHAnsi"/>
+      <w:rFonts w:asciiTheme="majorHAnsi" w:cstheme="majorBidi" w:eastAsiaTheme="majorEastAsia" w:hAnsiTheme="majorHAnsi"/>
       <w:b/>
       <w:bCs/>
-      <w:color w:val="000000"/>
-      <w:sz w:val="24"/>
+      <w:color w:themeColor="accent1" w:val="4F81BD"/>
+      <w:sz w:val="28"/>
       <w:szCs w:val="28"/>
     </w:rPr>
   </w:style>
@@ -1962,15 +1903,14 @@
     <w:pPr>
       <w:keepNext/>
       <w:keepLines/>
-      <w:spacing w:after="0" w:before="200" w:line="276" w:lineRule="auto"/>
-      <w:jc w:val="both"/>
+      <w:spacing w:after="0" w:before="200"/>
       <w:outlineLvl w:val="2"/>
     </w:pPr>
     <w:rPr>
-      <w:rFonts w:ascii="Times New Roman" w:asciiTheme="majorHAnsi" w:cstheme="majorBidi" w:eastAsia="Times New Roman" w:eastAsiaTheme="majorEastAsia" w:hAnsi="Times New Roman" w:hAnsiTheme="majorHAnsi"/>
+      <w:rFonts w:asciiTheme="majorHAnsi" w:cstheme="majorBidi" w:eastAsiaTheme="majorEastAsia" w:hAnsiTheme="majorHAnsi"/>
       <w:b/>
       <w:bCs/>
-      <w:color w:val="000000"/>
+      <w:color w:themeColor="accent1" w:val="4F81BD"/>
       <w:sz w:val="24"/>
       <w:szCs w:val="24"/>
     </w:rPr>
@@ -1985,15 +1925,14 @@
     <w:pPr>
       <w:keepNext/>
       <w:keepLines/>
-      <w:spacing w:after="0" w:before="200" w:line="276" w:lineRule="auto"/>
-      <w:jc w:val="both"/>
+      <w:spacing w:after="0" w:before="200"/>
       <w:outlineLvl w:val="3"/>
     </w:pPr>
     <w:rPr>
-      <w:rFonts w:ascii="Times New Roman" w:asciiTheme="majorHAnsi" w:cstheme="majorBidi" w:eastAsia="Times New Roman" w:eastAsiaTheme="majorEastAsia" w:hAnsi="Times New Roman" w:hAnsiTheme="majorHAnsi"/>
+      <w:rFonts w:asciiTheme="majorHAnsi" w:cstheme="majorBidi" w:eastAsiaTheme="majorEastAsia" w:hAnsiTheme="majorHAnsi"/>
       <w:i/>
       <w:bCs/>
-      <w:color w:val="000000"/>
+      <w:color w:themeColor="accent1" w:val="4F81BD"/>
       <w:sz w:val="24"/>
       <w:szCs w:val="24"/>
     </w:rPr>
@@ -2008,14 +1947,13 @@
     <w:pPr>
       <w:keepNext/>
       <w:keepLines/>
-      <w:spacing w:after="0" w:before="200" w:line="276" w:lineRule="auto"/>
-      <w:jc w:val="both"/>
+      <w:spacing w:after="0" w:before="200"/>
       <w:outlineLvl w:val="4"/>
     </w:pPr>
     <w:rPr>
-      <w:rFonts w:ascii="Times New Roman" w:asciiTheme="majorHAnsi" w:cstheme="majorBidi" w:eastAsia="Times New Roman" w:eastAsiaTheme="majorEastAsia" w:hAnsi="Times New Roman" w:hAnsiTheme="majorHAnsi"/>
+      <w:rFonts w:asciiTheme="majorHAnsi" w:cstheme="majorBidi" w:eastAsiaTheme="majorEastAsia" w:hAnsiTheme="majorHAnsi"/>
       <w:iCs/>
-      <w:color w:val="000000"/>
+      <w:color w:themeColor="accent1" w:val="4F81BD"/>
       <w:sz w:val="24"/>
       <w:szCs w:val="24"/>
     </w:rPr>
@@ -2030,13 +1968,12 @@
     <w:pPr>
       <w:keepNext/>
       <w:keepLines/>
-      <w:spacing w:after="0" w:before="200" w:line="276" w:lineRule="auto"/>
-      <w:jc w:val="both"/>
+      <w:spacing w:after="0" w:before="200"/>
       <w:outlineLvl w:val="5"/>
     </w:pPr>
     <w:rPr>
-      <w:rFonts w:ascii="Times New Roman" w:asciiTheme="majorHAnsi" w:cstheme="majorBidi" w:eastAsia="Times New Roman" w:eastAsiaTheme="majorEastAsia" w:hAnsi="Times New Roman" w:hAnsiTheme="majorHAnsi"/>
-      <w:color w:val="000000"/>
+      <w:rFonts w:asciiTheme="majorHAnsi" w:cstheme="majorBidi" w:eastAsiaTheme="majorEastAsia" w:hAnsiTheme="majorHAnsi"/>
+      <w:color w:themeColor="accent1" w:val="4F81BD"/>
       <w:sz w:val="24"/>
       <w:szCs w:val="24"/>
     </w:rPr>
@@ -2051,13 +1988,12 @@
     <w:pPr>
       <w:keepNext/>
       <w:keepLines/>
-      <w:spacing w:after="0" w:before="200" w:line="276" w:lineRule="auto"/>
-      <w:jc w:val="both"/>
+      <w:spacing w:after="0" w:before="200"/>
       <w:outlineLvl w:val="6"/>
     </w:pPr>
     <w:rPr>
-      <w:rFonts w:ascii="Times New Roman" w:asciiTheme="majorHAnsi" w:cstheme="majorBidi" w:eastAsia="Times New Roman" w:eastAsiaTheme="majorEastAsia" w:hAnsi="Times New Roman" w:hAnsiTheme="majorHAnsi"/>
-      <w:color w:val="000000"/>
+      <w:rFonts w:asciiTheme="majorHAnsi" w:cstheme="majorBidi" w:eastAsiaTheme="majorEastAsia" w:hAnsiTheme="majorHAnsi"/>
+      <w:color w:themeColor="accent1" w:val="4F81BD"/>
       <w:sz w:val="24"/>
       <w:szCs w:val="24"/>
     </w:rPr>
@@ -2072,13 +2008,12 @@
     <w:pPr>
       <w:keepNext/>
       <w:keepLines/>
-      <w:spacing w:after="0" w:before="200" w:line="276" w:lineRule="auto"/>
-      <w:jc w:val="both"/>
+      <w:spacing w:after="0" w:before="200"/>
       <w:outlineLvl w:val="7"/>
     </w:pPr>
     <w:rPr>
-      <w:rFonts w:ascii="Times New Roman" w:asciiTheme="majorHAnsi" w:cstheme="majorBidi" w:eastAsia="Times New Roman" w:eastAsiaTheme="majorEastAsia" w:hAnsi="Times New Roman" w:hAnsiTheme="majorHAnsi"/>
-      <w:color w:val="000000"/>
+      <w:rFonts w:asciiTheme="majorHAnsi" w:cstheme="majorBidi" w:eastAsiaTheme="majorEastAsia" w:hAnsiTheme="majorHAnsi"/>
+      <w:color w:themeColor="accent1" w:val="4F81BD"/>
       <w:sz w:val="24"/>
       <w:szCs w:val="24"/>
     </w:rPr>
@@ -2093,13 +2028,12 @@
     <w:pPr>
       <w:keepNext/>
       <w:keepLines/>
-      <w:spacing w:after="0" w:before="200" w:line="276" w:lineRule="auto"/>
-      <w:jc w:val="both"/>
+      <w:spacing w:after="0" w:before="200"/>
       <w:outlineLvl w:val="8"/>
     </w:pPr>
     <w:rPr>
-      <w:rFonts w:ascii="Times New Roman" w:asciiTheme="majorHAnsi" w:cstheme="majorBidi" w:eastAsia="Times New Roman" w:eastAsiaTheme="majorEastAsia" w:hAnsi="Times New Roman" w:hAnsiTheme="majorHAnsi"/>
-      <w:color w:val="000000"/>
+      <w:rFonts w:asciiTheme="majorHAnsi" w:cstheme="majorBidi" w:eastAsiaTheme="majorEastAsia" w:hAnsiTheme="majorHAnsi"/>
+      <w:color w:themeColor="accent1" w:val="4F81BD"/>
       <w:sz w:val="24"/>
       <w:szCs w:val="24"/>
     </w:rPr>
@@ -2112,15 +2046,9 @@
     <w:unhideWhenUsed/>
     <w:qFormat/>
     <w:pPr>
-      <w:spacing w:after="100" w:before="100" w:line="276" w:lineRule="auto"/>
+      <w:spacing w:after="100" w:before="100"/>
       <w:ind w:firstLine="0" w:left="480" w:right="480"/>
-      <w:jc w:val="both"/>
     </w:pPr>
-    <w:rPr>
-      <w:rFonts w:ascii="Times New Roman" w:eastAsia="Times New Roman" w:hAnsi="Times New Roman"/>
-      <w:color w:val="000000"/>
-      <w:sz w:val="24"/>
-    </w:rPr>
   </w:style>
   <w:style w:styleId="FootnoteText" w:type="paragraph">
     <w:name w:val="Footnote Text"/>
@@ -2129,25 +2057,11 @@
     <w:uiPriority w:val="9"/>
     <w:unhideWhenUsed/>
     <w:qFormat/>
-    <w:pPr>
-      <w:spacing w:line="276" w:lineRule="auto"/>
-      <w:jc w:val="both"/>
-    </w:pPr>
-    <w:rPr>
-      <w:rFonts w:ascii="Times New Roman" w:eastAsia="Times New Roman" w:hAnsi="Times New Roman"/>
-      <w:color w:val="000000"/>
-      <w:sz w:val="24"/>
-    </w:rPr>
   </w:style>
   <w:style w:default="1" w:styleId="DefaultParagraphFont" w:type="character">
     <w:name w:val="Default Paragraph Font"/>
     <w:semiHidden/>
     <w:unhideWhenUsed/>
-    <w:rPr>
-      <w:rFonts w:ascii="Times New Roman" w:eastAsia="Times New Roman" w:hAnsi="Times New Roman"/>
-      <w:color w:val="000000"/>
-      <w:sz w:val="24"/>
-    </w:rPr>
   </w:style>
   <w:style w:default="1" w:styleId="Table" w:type="table">
     <w:name w:val="Table"/>
@@ -2155,15 +2069,6 @@
     <w:semiHidden/>
     <w:unhideWhenUsed/>
     <w:qFormat/>
-    <w:pPr>
-      <w:spacing w:line="276" w:lineRule="auto"/>
-      <w:jc w:val="both"/>
-    </w:pPr>
-    <w:rPr>
-      <w:rFonts w:ascii="Times New Roman" w:eastAsia="Times New Roman" w:hAnsi="Times New Roman"/>
-      <w:color w:val="000000"/>
-      <w:sz w:val="24"/>
-    </w:rPr>
     <w:tblPr>
       <w:tblInd w:type="dxa" w:w="0"/>
       <w:tblCellMar>
@@ -2196,42 +2101,25 @@
     <w:pPr>
       <w:keepNext/>
       <w:keepLines/>
-      <w:spacing w:after="0" w:line="276" w:lineRule="auto"/>
-      <w:jc w:val="both"/>
+      <w:spacing w:after="0"/>
     </w:pPr>
     <w:rPr>
-      <w:rFonts w:ascii="Times New Roman" w:eastAsia="Times New Roman" w:hAnsi="Times New Roman"/>
       <w:b/>
-      <w:color w:val="000000"/>
-      <w:sz w:val="24"/>
     </w:rPr>
   </w:style>
   <w:style w:customStyle="1" w:styleId="Definition" w:type="paragraph">
     <w:name w:val="Definition"/>
     <w:basedOn w:val="Normal"/>
-    <w:pPr>
-      <w:spacing w:line="276" w:lineRule="auto"/>
-      <w:jc w:val="both"/>
-    </w:pPr>
-    <w:rPr>
-      <w:rFonts w:ascii="Times New Roman" w:eastAsia="Times New Roman" w:hAnsi="Times New Roman"/>
-      <w:color w:val="000000"/>
-      <w:sz w:val="24"/>
-    </w:rPr>
   </w:style>
   <w:style w:styleId="Caption" w:type="paragraph">
     <w:name w:val="Caption"/>
     <w:basedOn w:val="Normal"/>
     <w:link w:val="BodyTextChar"/>
     <w:pPr>
-      <w:spacing w:after="120" w:before="0" w:line="276" w:lineRule="auto"/>
-      <w:jc w:val="both"/>
+      <w:spacing w:after="120" w:before="0"/>
     </w:pPr>
     <w:rPr>
-      <w:rFonts w:ascii="Times New Roman" w:eastAsia="Times New Roman" w:hAnsi="Times New Roman"/>
       <w:i/>
-      <w:color w:val="000000"/>
-      <w:sz w:val="24"/>
     </w:rPr>
   </w:style>
   <w:style w:customStyle="1" w:styleId="TableCaption" w:type="paragraph">
@@ -2239,90 +2127,44 @@
     <w:basedOn w:val="Caption"/>
     <w:pPr>
       <w:keepNext/>
-      <w:spacing w:line="276" w:lineRule="auto"/>
-      <w:jc w:val="both"/>
     </w:pPr>
-    <w:rPr>
-      <w:rFonts w:ascii="Times New Roman" w:eastAsia="Times New Roman" w:hAnsi="Times New Roman"/>
-      <w:color w:val="000000"/>
-      <w:sz w:val="24"/>
-    </w:rPr>
   </w:style>
   <w:style w:customStyle="1" w:styleId="ImageCaption" w:type="paragraph">
     <w:name w:val="Image Caption"/>
     <w:basedOn w:val="Caption"/>
-    <w:pPr>
-      <w:spacing w:line="276" w:lineRule="auto"/>
-      <w:jc w:val="both"/>
-    </w:pPr>
-    <w:rPr>
-      <w:rFonts w:ascii="Times New Roman" w:eastAsia="Times New Roman" w:hAnsi="Times New Roman"/>
-      <w:color w:val="000000"/>
-      <w:sz w:val="24"/>
-    </w:rPr>
   </w:style>
   <w:style w:customStyle="1" w:styleId="Figure" w:type="paragraph">
     <w:name w:val="Figure"/>
     <w:basedOn w:val="Normal"/>
-    <w:pPr>
-      <w:spacing w:line="276" w:lineRule="auto"/>
-      <w:jc w:val="both"/>
-    </w:pPr>
-    <w:rPr>
-      <w:rFonts w:ascii="Times New Roman" w:eastAsia="Times New Roman" w:hAnsi="Times New Roman"/>
-      <w:color w:val="000000"/>
-      <w:sz w:val="24"/>
-    </w:rPr>
   </w:style>
   <w:style w:customStyle="1" w:styleId="CaptionedFigure" w:type="paragraph">
     <w:name w:val="Captioned Figure"/>
     <w:basedOn w:val="Figure"/>
     <w:pPr>
       <w:keepNext/>
-      <w:spacing w:line="276" w:lineRule="auto"/>
-      <w:jc w:val="both"/>
     </w:pPr>
-    <w:rPr>
-      <w:rFonts w:ascii="Times New Roman" w:eastAsia="Times New Roman" w:hAnsi="Times New Roman"/>
-      <w:color w:val="000000"/>
-      <w:sz w:val="24"/>
-    </w:rPr>
   </w:style>
   <w:style w:customStyle="1" w:styleId="BodyTextChar" w:type="character">
     <w:name w:val="Body Text Char"/>
     <w:basedOn w:val="DefaultParagraphFont"/>
     <w:link w:val="BodyText"/>
-    <w:rPr>
-      <w:rFonts w:ascii="Times New Roman" w:eastAsia="Times New Roman" w:hAnsi="Times New Roman"/>
-      <w:color w:val="000000"/>
-      <w:sz w:val="24"/>
-    </w:rPr>
   </w:style>
   <w:style w:customStyle="1" w:styleId="VerbatimChar" w:type="character">
     <w:name w:val="Verbatim Char"/>
     <w:basedOn w:val="BodyTextChar"/>
     <w:rPr>
-      <w:rFonts w:ascii="Times New Roman" w:eastAsia="Times New Roman" w:hAnsi="Times New Roman"/>
-      <w:color w:val="000000"/>
-      <w:sz w:val="24"/>
+      <w:rFonts w:ascii="Consolas" w:hAnsi="Consolas"/>
+      <w:sz w:val="22"/>
     </w:rPr>
   </w:style>
   <w:style w:customStyle="1" w:styleId="SectionNumber" w:type="character">
     <w:name w:val="Section Number"/>
     <w:basedOn w:val="BodyTextChar"/>
-    <w:rPr>
-      <w:rFonts w:ascii="Times New Roman" w:eastAsia="Times New Roman" w:hAnsi="Times New Roman"/>
-      <w:color w:val="000000"/>
-      <w:sz w:val="24"/>
-    </w:rPr>
   </w:style>
   <w:style w:styleId="FootnoteReference" w:type="character">
     <w:name w:val="Footnote Reference"/>
     <w:basedOn w:val="BodyTextChar"/>
     <w:rPr>
-      <w:rFonts w:ascii="Times New Roman" w:eastAsia="Times New Roman" w:hAnsi="Times New Roman"/>
-      <w:color w:val="000000"/>
-      <w:sz w:val="24"/>
       <w:vertAlign w:val="superscript"/>
     </w:rPr>
   </w:style>
@@ -2330,9 +2172,7 @@
     <w:name w:val="Hyperlink"/>
     <w:basedOn w:val="BodyTextChar"/>
     <w:rPr>
-      <w:rFonts w:ascii="Times New Roman" w:eastAsia="Times New Roman" w:hAnsi="Times New Roman"/>
-      <w:color w:val="000000"/>
-      <w:sz w:val="24"/>
+      <w:color w:themeColor="accent1" w:val="4F81BD"/>
     </w:rPr>
   </w:style>
   <w:style w:styleId="TOCHeading" w:type="paragraph">
@@ -2343,16 +2183,14 @@
     <w:unhideWhenUsed/>
     <w:qFormat/>
     <w:pPr>
-      <w:spacing w:before="240" w:line="276" w:lineRule="auto"/>
-      <w:jc w:val="both"/>
+      <w:spacing w:before="240" w:line="259" w:lineRule="auto"/>
       <w:outlineLvl w:val="9"/>
     </w:pPr>
     <w:rPr>
-      <w:rFonts w:ascii="Times New Roman" w:asciiTheme="majorHAnsi" w:cstheme="majorBidi" w:eastAsia="Times New Roman" w:eastAsiaTheme="majorEastAsia" w:hAnsi="Times New Roman" w:hAnsiTheme="majorHAnsi"/>
+      <w:rFonts w:asciiTheme="majorHAnsi" w:cstheme="majorBidi" w:eastAsiaTheme="majorEastAsia" w:hAnsiTheme="majorHAnsi"/>
       <w:b w:val="0"/>
       <w:bCs w:val="0"/>
-      <w:color w:val="000000"/>
-      <w:sz w:val="24"/>
+      <w:color w:themeColor="accent1" w:themeShade="BF" w:val="365F91"/>
     </w:rPr>
   </w:style>
   <w:style w:type="paragraph" w:customStyle="1" w:styleId="SourceCode">

</xml_diff>